<commit_message>
Previo a reeestructuracion | Total cambio de persistencia
</commit_message>
<xml_diff>
--- a/Explain.docx
+++ b/Explain.docx
@@ -3,86 +3,6 @@
 <w:document xmlns:wpc="http://schemas.microsoft.com/office/word/2010/wordprocessingCanvas" xmlns:cx="http://schemas.microsoft.com/office/drawing/2014/chartex" xmlns:cx1="http://schemas.microsoft.com/office/drawing/2015/9/8/chartex" xmlns:cx2="http://schemas.microsoft.com/office/drawing/2015/10/21/chartex" xmlns:cx3="http://schemas.microsoft.com/office/drawing/2016/5/9/chartex" xmlns:cx4="http://schemas.microsoft.com/office/drawing/2016/5/10/chartex" xmlns:cx5="http://schemas.microsoft.com/office/drawing/2016/5/11/chartex" xmlns:cx6="http://schemas.microsoft.com/office/drawing/2016/5/12/chartex" xmlns:cx7="http://schemas.microsoft.com/office/drawing/2016/5/13/chartex" xmlns:cx8="http://schemas.microsoft.com/office/drawing/2016/5/14/chartex" xmlns:mc="http://schemas.openxmlformats.org/markup-compatibility/2006" xmlns:aink="http://schemas.microsoft.com/office/drawing/2016/ink" xmlns:am3d="http://schemas.microsoft.com/office/drawing/2017/model3d" xmlns:o="urn:schemas-microsoft-com:office:office" xmlns:oel="http://schemas.microsoft.com/office/2019/extlst" xmlns:r="http://schemas.openxmlformats.org/officeDocument/2006/relationships" xmlns:m="http://schemas.openxmlformats.org/officeDocument/2006/math" xmlns:v="urn:schemas-microsoft-com:vml" xmlns:wp14="http://schemas.microsoft.com/office/word/2010/wordprocessingDrawing" xmlns:wp="http://schemas.openxmlformats.org/drawingml/2006/wordprocessingDrawing" xmlns:w10="urn:schemas-microsoft-com:office:word" xmlns:w="http://schemas.openxmlformats.org/wordprocessingml/2006/main" xmlns:w14="http://schemas.microsoft.com/office/word/2010/wordml" xmlns:w15="http://schemas.microsoft.com/office/word/2012/wordml" xmlns:w16cex="http://schemas.microsoft.com/office/word/2018/wordml/cex" xmlns:w16cid="http://schemas.microsoft.com/office/word/2016/wordml/cid" xmlns:w16="http://schemas.microsoft.com/office/word/2018/wordml" xmlns:w16du="http://schemas.microsoft.com/office/word/2023/wordml/word16du" xmlns:w16sdtdh="http://schemas.microsoft.com/office/word/2020/wordml/sdtdatahash" xmlns:w16sdtfl="http://schemas.microsoft.com/office/word/2024/wordml/sdtformatlock" xmlns:w16se="http://schemas.microsoft.com/office/word/2015/wordml/symex" xmlns:wpg="http://schemas.microsoft.com/office/word/2010/wordprocessingGroup" xmlns:wpi="http://schemas.microsoft.com/office/word/2010/wordprocessingInk" xmlns:wne="http://schemas.microsoft.com/office/word/2006/wordml" xmlns:wps="http://schemas.microsoft.com/office/word/2010/wordprocessingShape" mc:Ignorable="w14 w15 w16se w16cid w16 w16cex w16sdtdh w16sdtfl w16du wp14">
   <w:body>
     <w:p>
-      <w:pPr>
-        <w:rPr>
-          <w:lang w:val="en-US"/>
-        </w:rPr>
-      </w:pPr>
-      <w:r>
-        <w:rPr>
-          <w:lang w:val="en-US"/>
-        </w:rPr>
-        <w:t>Ex</w:t>
-      </w:r>
-      <w:r>
-        <w:rPr>
-          <w:lang w:val="en-US"/>
-        </w:rPr>
-        <w:t>plain</w:t>
-      </w:r>
-      <w:r>
-        <w:rPr>
-          <w:lang w:val="en-US"/>
-        </w:rPr>
-        <w:br/>
-      </w:r>
-      <w:r>
-        <w:rPr>
-          <w:lang w:val="en-US"/>
-        </w:rPr>
-        <w:t>C:\Users\WINDOWS\Desktop\DriveProgra\Xelle\.vscode\settings.json</w:t>
-      </w:r>
-      <w:r>
-        <w:rPr>
-          <w:lang w:val="en-US"/>
-        </w:rPr>
-        <w:br/>
-        <w:t>{</w:t>
-      </w:r>
-    </w:p>
-    <w:p>
-      <w:r>
-        <w:rPr>
-          <w:lang w:val="en-US"/>
-        </w:rPr>
-        <w:t xml:space="preserve">    </w:t>
-      </w:r>
-      <w:r>
-        <w:t>"</w:t>
-      </w:r>
-      <w:proofErr w:type="spellStart"/>
-      <w:r>
-        <w:t>java.compile.nullAnalysis.mode</w:t>
-      </w:r>
-      <w:proofErr w:type="spellEnd"/>
-      <w:r>
-        <w:t>": "</w:t>
-      </w:r>
-      <w:proofErr w:type="spellStart"/>
-      <w:r>
-        <w:t>automatic</w:t>
-      </w:r>
-      <w:proofErr w:type="spellEnd"/>
-      <w:r>
-        <w:t>"</w:t>
-      </w:r>
-    </w:p>
-    <w:p>
-      <w:r>
-        <w:t>}</w:t>
-      </w:r>
-    </w:p>
-    <w:p>
-      <w:r>
-        <w:br/>
-        <w:t>_______________________________________________________________________________________</w:t>
-      </w:r>
-      <w:r>
-        <w:br/>
-      </w:r>
-    </w:p>
-    <w:p/>
-    <w:p>
       <w:r>
         <w:t>Cambia módulos.</w:t>
       </w:r>
@@ -121,9 +41,14 @@
         <w:t>Lab Calidad</w:t>
       </w:r>
     </w:p>
-    <w:p>
-      <w:r>
-        <w:t xml:space="preserve">el estado de </w:t>
+    <w:p/>
+    <w:p/>
+    <w:p>
+      <w:r>
+        <w:t>E</w:t>
+      </w:r>
+      <w:r>
+        <w:t xml:space="preserve">l estado de </w:t>
       </w:r>
       <w:r>
         <w:rPr>
@@ -235,7 +160,6 @@
     </w:p>
     <w:p>
       <w:r>
-        <w:lastRenderedPageBreak/>
         <w:t xml:space="preserve">FASE 2: Procesamiento y Macro </w:t>
       </w:r>
     </w:p>
@@ -302,6 +226,7 @@
           <w:b/>
           <w:bCs/>
         </w:rPr>
+        <w:lastRenderedPageBreak/>
         <w:t>Integridad de Membranas / Tejido:</w:t>
       </w:r>
       <w:r>
@@ -500,7 +425,15 @@
       </w:r>
       <w:r>
         <w:br/>
-        <w:t>Cada vez que se presione la tarjeta será como “documento nuevo”. Se cargara el documento</w:t>
+        <w:t xml:space="preserve">Cada vez que se presione la tarjeta será como “documento nuevo”. Se </w:t>
+      </w:r>
+      <w:proofErr w:type="gramStart"/>
+      <w:r>
+        <w:t>cargara</w:t>
+      </w:r>
+      <w:proofErr w:type="gramEnd"/>
+      <w:r>
+        <w:t xml:space="preserve"> el documento</w:t>
       </w:r>
       <w:r>
         <w:t xml:space="preserve"> en blanco.</w:t>
@@ -529,9 +462,6 @@
       </w:r>
       <w:r>
         <w:br/>
-      </w:r>
-      <w:r>
-        <w:lastRenderedPageBreak/>
         <w:t xml:space="preserve">el botón guardado debe guardar en tabla. En caso de modificación, se sobrescribe campos correspondientes, exceptuando id </w:t>
       </w:r>
       <w:proofErr w:type="spellStart"/>
@@ -1617,6 +1547,7 @@
   <w:style w:type="character" w:default="1" w:styleId="Fuentedeprrafopredeter">
     <w:name w:val="Default Paragraph Font"/>
     <w:uiPriority w:val="1"/>
+    <w:semiHidden/>
     <w:unhideWhenUsed/>
   </w:style>
   <w:style w:type="table" w:default="1" w:styleId="Tablanormal">

</xml_diff>

<commit_message>
Full commit etiquetas y formatos. Listo para migracion
</commit_message>
<xml_diff>
--- a/Explain.docx
+++ b/Explain.docx
@@ -13,12 +13,21 @@
     </w:p>
     <w:p>
       <w:r>
+        <w:br/>
+      </w:r>
+      <w:r>
         <w:t>Administración</w:t>
       </w:r>
     </w:p>
     <w:p>
       <w:r>
-        <w:t>Almacen</w:t>
+        <w:t>Almac</w:t>
+      </w:r>
+      <w:r>
+        <w:t>é</w:t>
+      </w:r>
+      <w:r>
+        <w:t>n</w:t>
       </w:r>
     </w:p>
     <w:p>
@@ -208,6 +217,7 @@
           <w:b/>
           <w:bCs/>
         </w:rPr>
+        <w:lastRenderedPageBreak/>
         <w:t>Apariencia Visual:</w:t>
       </w:r>
       <w:r>
@@ -226,7 +236,6 @@
           <w:b/>
           <w:bCs/>
         </w:rPr>
-        <w:lastRenderedPageBreak/>
         <w:t>Integridad de Membranas / Tejido:</w:t>
       </w:r>
       <w:r>
@@ -358,10 +367,6 @@
       </w:r>
       <w:r>
         <w:br/>
-        <w:t>Explica persistencia actual</w:t>
-      </w:r>
-      <w:r>
-        <w:br/>
         <w:t xml:space="preserve">La </w:t>
       </w:r>
       <w:proofErr w:type="spellStart"/>
@@ -446,12 +451,14 @@
         <w:t>de cada formato quita el botón limpiar</w:t>
       </w:r>
       <w:r>
-        <w:br/>
-        <w:t xml:space="preserve">solo </w:t>
+        <w:t xml:space="preserve"> </w:t>
+      </w:r>
+      <w:r>
+        <w:t>solo m</w:t>
       </w:r>
       <w:proofErr w:type="spellStart"/>
       <w:r>
-        <w:t>manten</w:t>
+        <w:t>anten</w:t>
       </w:r>
       <w:proofErr w:type="spellEnd"/>
       <w:r>
@@ -471,6 +478,16 @@
       <w:proofErr w:type="spellEnd"/>
       <w:r>
         <w:t>.</w:t>
+      </w:r>
+      <w:r>
+        <w:t xml:space="preserve"> El de imprimir mantendrá sus funciones</w:t>
+      </w:r>
+      <w:r>
+        <w:br/>
+      </w:r>
+      <w:r>
+        <w:br/>
+        <w:t>Que la persistencia sea acorde a lo mas recomendado</w:t>
       </w:r>
     </w:p>
     <w:sectPr>

</xml_diff>